<commit_message>
CDD refresh tracker archive: 2026-04-06
</commit_message>
<xml_diff>
--- a/history/registers/cdd-refresh/2026-04-06.docx
+++ b/history/registers/cdd-refresh/2026-04-06.docx
@@ -324,19 +324,19 @@
           <w:rFonts w:ascii="Courier New" w:hAnsi="Courier New" w:cs="Courier New"/>
           <w:sz w:val="20"/>
         </w:rPr>
-        <w:t xml:space="preserve">Missing baseline CDD date  0    </w:t>
-      </w:r>
-    </w:p>
-    <w:p>
-      <w:pPr>
-        <w:spacing w:after="0"/>
-      </w:pPr>
-      <w:r>
-        <w:rPr>
-          <w:rFonts w:ascii="Courier New" w:hAnsi="Courier New" w:cs="Courier New"/>
-          <w:sz w:val="20"/>
-        </w:rPr>
-        <w:t xml:space="preserve">Total counterparties       0    </w:t>
+        <w:t xml:space="preserve">Missing baseline CDD date  3    </w:t>
+      </w:r>
+    </w:p>
+    <w:p>
+      <w:pPr>
+        <w:spacing w:after="0"/>
+      </w:pPr>
+      <w:r>
+        <w:rPr>
+          <w:rFonts w:ascii="Courier New" w:hAnsi="Courier New" w:cs="Courier New"/>
+          <w:sz w:val="20"/>
+        </w:rPr>
+        <w:t xml:space="preserve">Total counterparties       3    </w:t>
       </w:r>
     </w:p>
     <w:p>
@@ -472,7 +472,55 @@
           <w:rFonts w:ascii="Courier New" w:hAnsi="Courier New" w:cs="Courier New"/>
           <w:sz w:val="20"/>
         </w:rPr>
-        <w:t xml:space="preserve">(none)</w:t>
+        <w:t xml:space="preserve">Counterparty                        Risk    Last CDD   Due by     Days</w:t>
+      </w:r>
+    </w:p>
+    <w:p>
+      <w:pPr>
+        <w:spacing w:after="0"/>
+      </w:pPr>
+      <w:r>
+        <w:rPr>
+          <w:rFonts w:ascii="Courier New" w:hAnsi="Courier New" w:cs="Courier New"/>
+          <w:sz w:val="20"/>
+        </w:rPr>
+        <w:t xml:space="preserve">----------------------------------  ------  ---------  ---------  ----</w:t>
+      </w:r>
+    </w:p>
+    <w:p>
+      <w:pPr>
+        <w:spacing w:after="0"/>
+      </w:pPr>
+      <w:r>
+        <w:rPr>
+          <w:rFonts w:ascii="Courier New" w:hAnsi="Courier New" w:cs="Courier New"/>
+          <w:sz w:val="20"/>
+        </w:rPr>
+        <w:t xml:space="preserve">VAT Compliance for Precious Metals  medium  (missing)  (unknown)      </w:t>
+      </w:r>
+    </w:p>
+    <w:p>
+      <w:pPr>
+        <w:spacing w:after="0"/>
+      </w:pPr>
+      <w:r>
+        <w:rPr>
+          <w:rFonts w:ascii="Courier New" w:hAnsi="Courier New" w:cs="Courier New"/>
+          <w:sz w:val="20"/>
+        </w:rPr>
+        <w:t xml:space="preserve">VAT for Precious Metals             medium  (missing)  (unknown)      </w:t>
+      </w:r>
+    </w:p>
+    <w:p>
+      <w:pPr>
+        <w:spacing w:after="0"/>
+      </w:pPr>
+      <w:r>
+        <w:rPr>
+          <w:rFonts w:ascii="Courier New" w:hAnsi="Courier New" w:cs="Courier New"/>
+          <w:sz w:val="20"/>
+        </w:rPr>
+        <w:t xml:space="preserve">VAT Precious Metals                 medium  (missing)  (unknown)      </w:t>
       </w:r>
     </w:p>
     <w:p>

</xml_diff>